<commit_message>
add invoice discount setting
</commit_message>
<xml_diff>
--- a/Readme.docx
+++ b/Readme.docx
@@ -16,25 +16,12 @@
     </w:p>
     <w:p>
       <w:r>
-        <w:t xml:space="preserve">Pin </w:t>
-      </w:r>
-      <w:proofErr w:type="gramStart"/>
-      <w:r>
-        <w:t>Number :</w:t>
-      </w:r>
-      <w:proofErr w:type="gramEnd"/>
-      <w:r>
-        <w:t xml:space="preserve"> Z4</w:t>
-      </w:r>
-    </w:p>
-    <w:p>
-      <w:proofErr w:type="gramStart"/>
-      <w:r>
-        <w:t>Password :Z</w:t>
-      </w:r>
-      <w:proofErr w:type="gramEnd"/>
-      <w:r>
-        <w:t>5</w:t>
+        <w:t>Pin Number : Z4</w:t>
+      </w:r>
+    </w:p>
+    <w:p>
+      <w:r>
+        <w:t>Password :Z5</w:t>
       </w:r>
       <w:r>
         <w:br/>
@@ -91,6 +78,9 @@
     </w:p>
     <w:p>
       <w:r>
+        <w:rPr>
+          <w:noProof/>
+        </w:rPr>
         <w:drawing>
           <wp:inline distT="0" distB="0" distL="0" distR="0" wp14:anchorId="21131E7E" wp14:editId="75859732">
             <wp:extent cx="5487166" cy="2019582"/>
@@ -152,6 +142,9 @@
     </w:p>
     <w:p>
       <w:r>
+        <w:rPr>
+          <w:noProof/>
+        </w:rPr>
         <w:drawing>
           <wp:inline distT="0" distB="0" distL="0" distR="0" wp14:anchorId="59B0A7D0" wp14:editId="1DFBE8B5">
             <wp:extent cx="5943600" cy="1893570"/>
@@ -202,6 +195,9 @@
         <w:br/>
       </w:r>
       <w:r>
+        <w:rPr>
+          <w:noProof/>
+        </w:rPr>
         <w:drawing>
           <wp:inline distT="0" distB="0" distL="0" distR="0" wp14:anchorId="16131DA6" wp14:editId="7875D443">
             <wp:extent cx="5943600" cy="1721485"/>
@@ -241,11 +237,7 @@
     </w:p>
     <w:p>
       <w:r>
-        <w:t xml:space="preserve">Register work can be done in two ways: one is to register prices for a new </w:t>
-      </w:r>
-      <w:proofErr w:type="gramStart"/>
-      <w:r>
-        <w:t>product</w:t>
+        <w:t>Register work can be done in two ways: one is to register prices for a new product</w:t>
       </w:r>
       <w:r>
         <w:t>(</w:t>
@@ -253,7 +245,6 @@
       <w:r>
         <w:t xml:space="preserve"> service</w:t>
       </w:r>
-      <w:proofErr w:type="gramEnd"/>
       <w:r>
         <w:t xml:space="preserve"> )</w:t>
       </w:r>
@@ -264,6 +255,9 @@
         <w:br/>
       </w:r>
       <w:r>
+        <w:rPr>
+          <w:noProof/>
+        </w:rPr>
         <w:drawing>
           <wp:inline distT="0" distB="0" distL="0" distR="0" wp14:anchorId="6CAF0B28" wp14:editId="030EC8CF">
             <wp:extent cx="5943600" cy="896620"/>
@@ -320,6 +314,9 @@
         <w:br/>
       </w:r>
       <w:r>
+        <w:rPr>
+          <w:noProof/>
+        </w:rPr>
         <w:drawing>
           <wp:inline distT="0" distB="0" distL="0" distR="0" wp14:anchorId="5D7A3725" wp14:editId="108A333D">
             <wp:extent cx="5943600" cy="4627880"/>
@@ -364,6 +361,9 @@
     </w:p>
     <w:p>
       <w:r>
+        <w:rPr>
+          <w:noProof/>
+        </w:rPr>
         <w:drawing>
           <wp:inline distT="0" distB="0" distL="0" distR="0" wp14:anchorId="026AD034" wp14:editId="0A5C5ECD">
             <wp:extent cx="5943600" cy="1544955"/>
@@ -424,6 +424,23 @@
     <w:p>
       <w:r>
         <w:lastRenderedPageBreak/>
+        <w:t>3) Invoice discount.</w:t>
+      </w:r>
+      <w:r>
+        <w:br/>
+        <w:t>The discount value is applied on each invoice .</w:t>
+      </w:r>
+      <w:r>
+        <w:br/>
+        <w:t>when creating new Invoice , on popup asking discount value , you can input new invoice value.</w:t>
+      </w:r>
+      <w:r>
+        <w:br/>
+        <w:t>If the invoice is not default type, the value set with 0.05 (5%).</w:t>
+      </w:r>
+    </w:p>
+    <w:p>
+      <w:r>
         <w:br/>
       </w:r>
       <w:r>
@@ -1057,6 +1074,7 @@
   <w:style w:type="character" w:default="1" w:styleId="DefaultParagraphFont">
     <w:name w:val="Default Paragraph Font"/>
     <w:uiPriority w:val="1"/>
+    <w:semiHidden/>
     <w:unhideWhenUsed/>
   </w:style>
   <w:style w:type="table" w:default="1" w:styleId="TableNormal">

</xml_diff>

<commit_message>
correct some information on the Readme and decorate frontpage
</commit_message>
<xml_diff>
--- a/Readme.docx
+++ b/Readme.docx
@@ -66,6 +66,11 @@
       </w:r>
       <w:r>
         <w:t>.</w:t>
+      </w:r>
+    </w:p>
+    <w:p>
+      <w:r>
+        <w:t>And Z2 has the information too.</w:t>
       </w:r>
     </w:p>
     <w:p>

</xml_diff>

<commit_message>
Add contents about QR codes on the readme.doc file
</commit_message>
<xml_diff>
--- a/Readme.docx
+++ b/Readme.docx
@@ -445,6 +445,17 @@
       </w:r>
     </w:p>
     <w:p>
+      <w:r>
+        <w:br/>
+      </w:r>
+      <w:r>
+        <w:t>3. QR Code register</w:t>
+      </w:r>
+    </w:p>
+    <w:p>
+      <w:r>
+        <w:t>All QR codes are represent the product information.</w:t>
+      </w:r>
       <w:r>
         <w:br/>
       </w:r>

</xml_diff>